<commit_message>
chore: add VS Code workspace settings and update resume documents
</commit_message>
<xml_diff>
--- a/static/resume.docx
+++ b/static/resume.docx
@@ -1,6 +1,6 @@
 
 <file path=word/document.xml><?xml version="1.0" encoding="utf-8"?>
-<w:document xmlns:wpc="http://schemas.microsoft.com/office/word/2010/wordprocessingCanvas" xmlns:mc="http://schemas.openxmlformats.org/markup-compatibility/2006" xmlns:o="urn:schemas-microsoft-com:office:office" xmlns:r="http://schemas.openxmlformats.org/officeDocument/2006/relationships" xmlns:m="http://schemas.openxmlformats.org/officeDocument/2006/math" xmlns:v="urn:schemas-microsoft-com:vml" xmlns:wp14="http://schemas.microsoft.com/office/word/2010/wordprocessingDrawing" xmlns:wp="http://schemas.openxmlformats.org/drawingml/2006/wordprocessingDrawing" xmlns:w10="urn:schemas-microsoft-com:office:word" xmlns:w="http://schemas.openxmlformats.org/wordprocessingml/2006/main" xmlns:w14="http://schemas.microsoft.com/office/word/2010/wordml" xmlns:w15="http://schemas.microsoft.com/office/word/2012/wordml" xmlns:wpg="http://schemas.microsoft.com/office/word/2010/wordprocessingGroup" xmlns:wpi="http://schemas.microsoft.com/office/word/2010/wordprocessingInk" xmlns:wne="http://schemas.microsoft.com/office/word/2006/wordml" xmlns:wps="http://schemas.microsoft.com/office/word/2010/wordprocessingShape" xmlns:cx="http://schemas.microsoft.com/office/drawing/2014/chartex" xmlns:cx1="http://schemas.microsoft.com/office/drawing/2015/9/8/chartex" xmlns:cx2="http://schemas.microsoft.com/office/drawing/2015/10/21/chartex" xmlns:cx3="http://schemas.microsoft.com/office/drawing/2016/5/9/chartex" xmlns:cx4="http://schemas.microsoft.com/office/drawing/2016/5/10/chartex" xmlns:cx5="http://schemas.microsoft.com/office/drawing/2016/5/11/chartex" xmlns:cx6="http://schemas.microsoft.com/office/drawing/2016/5/12/chartex" xmlns:cx7="http://schemas.microsoft.com/office/drawing/2016/5/13/chartex" xmlns:cx8="http://schemas.microsoft.com/office/drawing/2016/5/14/chartex" xmlns:aink="http://schemas.microsoft.com/office/drawing/2016/ink" xmlns:am3d="http://schemas.microsoft.com/office/drawing/2017/model3d" xmlns:w16cex="http://schemas.microsoft.com/office/word/2018/wordml/cex" xmlns:w16cid="http://schemas.microsoft.com/office/word/2016/wordml/cid" xmlns:w16="http://schemas.microsoft.com/office/word/2018/wordml" xmlns:w16sdtdh="http://schemas.microsoft.com/office/word/2020/wordml/sdtdatahash" xmlns:w16se="http://schemas.microsoft.com/office/word/2015/wordml/symex" mc:Ignorable="w14 w15 wp14">
+<w:document xmlns:ns1="http://schemas.openxmlformats.org/markup-compatibility/2006" xmlns:ns2="http://schemas.openxmlformats.org/officeDocument/2006/relationships" xmlns:w="http://schemas.openxmlformats.org/wordprocessingml/2006/main" ns1:Ignorable="w14 w15 wp14">
   <w:body>
     <w:p>
       <w:pPr>
@@ -48,7 +48,7 @@
         </w:rPr>
         <w:t xml:space="preserve">sanjeevsethilive@gmail.com  |  +91-7975965223  |  </w:t>
       </w:r>
-      <w:hyperlink w:history="1" r:id="rIdtzep3actpsq9jaotixm_n">
+      <w:hyperlink w:history="1" ns2:id="rIdtzep3actpsq9jaotixm_n">
         <w:r>
           <w:rPr>
             <w:color w:val="1F3864"/>
@@ -67,7 +67,7 @@
         </w:rPr>
         <w:t xml:space="preserve">  |  </w:t>
       </w:r>
-      <w:hyperlink w:history="1" r:id="rIdzkhhmgxinquiv1hsup563">
+      <w:hyperlink w:history="1" ns2:id="rIdzkhhmgxinquiv1hsup563">
         <w:r>
           <w:rPr>
             <w:color w:val="1F3864"/>
@@ -86,7 +86,7 @@
         </w:rPr>
         <w:t xml:space="preserve">  |  </w:t>
       </w:r>
-      <w:hyperlink w:history="1" r:id="rIdgbbflljp6vpqgumavjotd">
+      <w:hyperlink w:history="1" ns2:id="rIdgbbflljp6vpqgumavjotd">
         <w:r>
           <w:rPr>
             <w:color w:val="1F3864"/>
@@ -131,14 +131,14 @@
           <w:sz w:val="21"/>
           <w:szCs w:val="21"/>
         </w:rPr>
-        <w:t xml:space="preserve">Research Intern, Network Engineering</w:t>
-      </w:r>
-      <w:r>
-        <w:rPr>
-          <w:sz w:val="21"/>
-          <w:szCs w:val="21"/>
-        </w:rPr>
-        <w:t xml:space="preserve">  —  NITK (Advisor: Prof. Mohit P. Tahiliani)</w:t>
+        <w:t xml:space="preserve">Network Engineering Intern</w:t>
+      </w:r>
+      <w:r>
+        <w:rPr>
+          <w:sz w:val="21"/>
+          <w:szCs w:val="21"/>
+        </w:rPr>
+        <w:t xml:space="preserve">  —  NITK</w:t>
       </w:r>
       <w:r>
         <w:rPr>
@@ -165,7 +165,71 @@
           <w:sz w:val="20"/>
           <w:szCs w:val="20"/>
         </w:rPr>
-        <w:t xml:space="preserve">Built WAN aggregation using OpenWrt and MPTCP to combine multiple physical links.</w:t>
+        <w:t xml:space="preserve">Built a </w:t>
+      </w:r>
+      <w:r>
+        <w:rPr>
+          <w:b/>
+          <w:bCs/>
+          <w:sz w:val="20"/>
+          <w:szCs w:val="20"/>
+        </w:rPr>
+        <w:t xml:space="preserve">multi-WAN link aggregation</w:t>
+      </w:r>
+      <w:r>
+        <w:rPr>
+          <w:sz w:val="20"/>
+          <w:szCs w:val="20"/>
+        </w:rPr>
+        <w:t xml:space="preserve"> gateway on </w:t>
+      </w:r>
+      <w:r>
+        <w:rPr>
+          <w:b/>
+          <w:bCs/>
+          <w:sz w:val="20"/>
+          <w:szCs w:val="20"/>
+        </w:rPr>
+        <w:t xml:space="preserve">OpenWrt</w:t>
+      </w:r>
+      <w:r>
+        <w:rPr>
+          <w:sz w:val="20"/>
+          <w:szCs w:val="20"/>
+        </w:rPr>
+        <w:t xml:space="preserve"> using </w:t>
+      </w:r>
+      <w:r>
+        <w:rPr>
+          <w:b/>
+          <w:bCs/>
+          <w:sz w:val="20"/>
+          <w:szCs w:val="20"/>
+        </w:rPr>
+        <w:t xml:space="preserve">Multipath TCP (MPTCP)</w:t>
+      </w:r>
+      <w:r>
+        <w:rPr>
+          <w:sz w:val="20"/>
+          <w:szCs w:val="20"/>
+        </w:rPr>
+        <w:t xml:space="preserve">, bonding </w:t>
+      </w:r>
+      <w:r>
+        <w:rPr>
+          <w:b/>
+          <w:bCs/>
+          <w:sz w:val="20"/>
+          <w:szCs w:val="20"/>
+        </w:rPr>
+        <w:t xml:space="preserve">2</w:t>
+      </w:r>
+      <w:r>
+        <w:rPr>
+          <w:sz w:val="20"/>
+          <w:szCs w:val="20"/>
+        </w:rPr>
+        <w:t xml:space="preserve"> independent uplinks into a single logical connection.</w:t>
       </w:r>
     </w:p>
     <w:p>
@@ -182,7 +246,39 @@
           <w:sz w:val="20"/>
           <w:szCs w:val="20"/>
         </w:rPr>
-        <w:t xml:space="preserve">Improved throughput by 60% while maintaining fault tolerance and session continuity.</w:t>
+        <w:t xml:space="preserve">Benchmarked aggregate throughput at </w:t>
+      </w:r>
+      <w:r>
+        <w:rPr>
+          <w:b/>
+          <w:bCs/>
+          <w:sz w:val="20"/>
+          <w:szCs w:val="20"/>
+        </w:rPr>
+        <w:t xml:space="preserve">70–80%</w:t>
+      </w:r>
+      <w:r>
+        <w:rPr>
+          <w:sz w:val="20"/>
+          <w:szCs w:val="20"/>
+        </w:rPr>
+        <w:t xml:space="preserve"> of the combined capacity of both links, roughly </w:t>
+      </w:r>
+      <w:r>
+        <w:rPr>
+          <w:b/>
+          <w:bCs/>
+          <w:sz w:val="20"/>
+          <w:szCs w:val="20"/>
+        </w:rPr>
+        <w:t xml:space="preserve">1.5x</w:t>
+      </w:r>
+      <w:r>
+        <w:rPr>
+          <w:sz w:val="20"/>
+          <w:szCs w:val="20"/>
+        </w:rPr>
+        <w:t xml:space="preserve"> the throughput of a single uplink.</w:t>
       </w:r>
     </w:p>
     <w:p>
@@ -199,60 +295,55 @@
           <w:sz w:val="20"/>
           <w:szCs w:val="20"/>
         </w:rPr>
-        <w:t xml:space="preserve">Deployed and tested WAN aggregation on Raspberry Pi hardware in a controlled lab environment under real-world traffic simulations.</w:t>
-      </w:r>
-    </w:p>
-    <w:p>
-      <w:pPr>
-        <w:pBdr>
-          <w:bottom w:val="single" w:color="1F3864" w:sz="6" w:space="2"/>
-        </w:pBdr>
-        <w:spacing w:after="80" w:before="220"/>
-      </w:pPr>
-      <w:r>
-        <w:rPr>
-          <w:b/>
-          <w:bCs/>
-          <w:color w:val="1F3864"/>
-          <w:spacing w:val="10"/>
-          <w:sz w:val="21"/>
-          <w:szCs w:val="21"/>
-        </w:rPr>
-        <w:t xml:space="preserve">PROJECTS</w:t>
-      </w:r>
-    </w:p>
-    <w:p>
-      <w:pPr>
-        <w:tabs>
-          <w:tab w:val="right" w:pos="9350"/>
-        </w:tabs>
-        <w:spacing w:after="40"/>
-      </w:pPr>
-      <w:r>
-        <w:rPr>
-          <w:b/>
-          <w:bCs/>
-          <w:sz w:val="21"/>
-          <w:szCs w:val="21"/>
-        </w:rPr>
-        <w:t xml:space="preserve">Layer 2 Packet Sniffer</w:t>
-      </w:r>
-      <w:r>
-        <w:rPr>
-          <w:sz w:val="21"/>
-          <w:szCs w:val="21"/>
-        </w:rPr>
-        <w:t xml:space="preserve">  —  Go, Linux, Raw Sockets</w:t>
-      </w:r>
-      <w:r>
-        <w:rPr>
-          <w:i/>
-          <w:iCs/>
-          <w:color w:val="444444"/>
-          <w:sz w:val="20"/>
-          <w:szCs w:val="20"/>
-        </w:rPr>
-        <w:t xml:space="preserve">	Aug 2026 – Present</w:t>
+        <w:t xml:space="preserve">Validated </w:t>
+      </w:r>
+      <w:r>
+        <w:rPr>
+          <w:b/>
+          <w:bCs/>
+          <w:sz w:val="20"/>
+          <w:szCs w:val="20"/>
+        </w:rPr>
+        <w:t xml:space="preserve">fault tolerance</w:t>
+      </w:r>
+      <w:r>
+        <w:rPr>
+          <w:sz w:val="20"/>
+          <w:szCs w:val="20"/>
+        </w:rPr>
+        <w:t xml:space="preserve"> by failing one uplink mid-transfer; active </w:t>
+      </w:r>
+      <w:r>
+        <w:rPr>
+          <w:b/>
+          <w:bCs/>
+          <w:sz w:val="20"/>
+          <w:szCs w:val="20"/>
+        </w:rPr>
+        <w:t xml:space="preserve">TCP</w:t>
+      </w:r>
+      <w:r>
+        <w:rPr>
+          <w:sz w:val="20"/>
+          <w:szCs w:val="20"/>
+        </w:rPr>
+        <w:t xml:space="preserve"> sessions failed over to the remaining link with </w:t>
+      </w:r>
+      <w:r>
+        <w:rPr>
+          <w:b/>
+          <w:bCs/>
+          <w:sz w:val="20"/>
+          <w:szCs w:val="20"/>
+        </w:rPr>
+        <w:t xml:space="preserve">zero connection resets</w:t>
+      </w:r>
+      <w:r>
+        <w:rPr>
+          <w:sz w:val="20"/>
+          <w:szCs w:val="20"/>
+        </w:rPr>
+        <w:t xml:space="preserve">.</w:t>
       </w:r>
     </w:p>
     <w:p>
@@ -269,7 +360,92 @@
           <w:sz w:val="20"/>
           <w:szCs w:val="20"/>
         </w:rPr>
-        <w:t xml:space="preserve">Developed a link-layer packet sniffer in Go using AF_PACKET raw sockets to capture and inspect live Ethernet frames directly from network interfaces.</w:t>
+        <w:t xml:space="preserve">Deployed and tested the gateway on </w:t>
+      </w:r>
+      <w:r>
+        <w:rPr>
+          <w:b/>
+          <w:bCs/>
+          <w:sz w:val="20"/>
+          <w:szCs w:val="20"/>
+        </w:rPr>
+        <w:t xml:space="preserve">Raspberry Pi</w:t>
+      </w:r>
+      <w:r>
+        <w:rPr>
+          <w:sz w:val="20"/>
+          <w:szCs w:val="20"/>
+        </w:rPr>
+        <w:t xml:space="preserve"> hardware in a lab environment under simulated real-world </w:t>
+      </w:r>
+      <w:r>
+        <w:rPr>
+          <w:b/>
+          <w:bCs/>
+          <w:sz w:val="20"/>
+          <w:szCs w:val="20"/>
+        </w:rPr>
+        <w:t xml:space="preserve">Linux</w:t>
+      </w:r>
+      <w:r>
+        <w:rPr>
+          <w:sz w:val="20"/>
+          <w:szCs w:val="20"/>
+        </w:rPr>
+        <w:t xml:space="preserve"> network traffic.</w:t>
+      </w:r>
+    </w:p>
+    <w:p>
+      <w:pPr>
+        <w:pBdr>
+          <w:bottom w:val="single" w:color="1F3864" w:sz="6" w:space="2"/>
+        </w:pBdr>
+        <w:spacing w:after="80" w:before="220"/>
+      </w:pPr>
+      <w:r>
+        <w:rPr>
+          <w:b/>
+          <w:bCs/>
+          <w:color w:val="1F3864"/>
+          <w:spacing w:val="10"/>
+          <w:sz w:val="21"/>
+          <w:szCs w:val="21"/>
+        </w:rPr>
+        <w:t xml:space="preserve">PROJECTS</w:t>
+      </w:r>
+    </w:p>
+    <w:p>
+      <w:pPr>
+        <w:tabs>
+          <w:tab w:val="right" w:pos="9350"/>
+        </w:tabs>
+        <w:spacing w:after="40"/>
+      </w:pPr>
+      <w:r>
+        <w:rPr>
+          <w:b/>
+          <w:bCs/>
+          <w:sz w:val="21"/>
+          <w:szCs w:val="21"/>
+        </w:rPr>
+        <w:t xml:space="preserve">Layer 2 Packet Sniffer</w:t>
+      </w:r>
+      <w:r>
+        <w:rPr>
+          <w:sz w:val="21"/>
+          <w:szCs w:val="21"/>
+        </w:rPr>
+        <w:t xml:space="preserve">  —  Go, Linux, Raw Sockets</w:t>
+      </w:r>
+      <w:r>
+        <w:rPr>
+          <w:i/>
+          <w:iCs/>
+          <w:color w:val="444444"/>
+          <w:sz w:val="20"/>
+          <w:szCs w:val="20"/>
+        </w:rPr>
+        <w:t xml:space="preserve">	Aug 2026 – Present</w:t>
       </w:r>
     </w:p>
     <w:p>
@@ -286,7 +462,7 @@
           <w:sz w:val="20"/>
           <w:szCs w:val="20"/>
         </w:rPr>
-        <w:t xml:space="preserve">Decoded Ethernet headers, extracting source/destination MAC addresses, EtherType, and encapsulated protocols (IPv4, ARP) for real-time traffic analysis.</w:t>
+        <w:t xml:space="preserve">Developed a link-layer packet sniffer in Go using AF_PACKET raw sockets to capture and inspect live Ethernet frames directly from network interfaces.</w:t>
       </w:r>
     </w:p>
     <w:p>
@@ -303,7 +479,7 @@
           <w:sz w:val="20"/>
           <w:szCs w:val="20"/>
         </w:rPr>
-        <w:t xml:space="preserve">[Add once benchmarked: sustained capture throughput / packet-loss rate under load]</w:t>
+        <w:t xml:space="preserve">Decoded Ethernet headers, extracting source/destination MAC addresses, EtherType, and encapsulated protocols (IPv4, ARP) for real-time traffic analysis.</w:t>
       </w:r>
     </w:p>
     <w:p>
@@ -578,7 +754,7 @@
           <w:sz w:val="20"/>
           <w:szCs w:val="20"/>
         </w:rPr>
-        <w:t xml:space="preserve">Kubernetes, Docker, Terraform, Helm, GitHub Actions, GCP</w:t>
+        <w:t xml:space="preserve">Kubernetes, Docker, Terraform, Helm, CI/CD, GitHub Actions, GCP</w:t>
       </w:r>
     </w:p>
     <w:p>

</xml_diff>